<commit_message>
Update ethics documentation: revise consent form, data management plan, information sheet, recruitment template, and research ethics full form for clarity and consistency.
</commit_message>
<xml_diff>
--- a/ethics/consent-form 26-3-26.docx
+++ b/ethics/consent-form 26-3-26.docx
@@ -482,7 +482,7 @@
         <w:rPr>
           <w:noProof/>
         </w:rPr>
-        <w:pict w14:anchorId="6B77E734">
+        <w:pict w14:anchorId="12C10632">
           <v:rect id="_x0000_i1025" alt="" style="width:451.3pt;height:.05pt;mso-width-percent:0;mso-height-percent:0;mso-width-percent:0;mso-height-percent:0" o:hralign="center" o:hrstd="t" o:hr="t" fillcolor="#a0a0a0" stroked="f"/>
         </w:pict>
       </w:r>
@@ -662,7 +662,13 @@
               <w:spacing w:after="60"/>
             </w:pPr>
             <w:r>
-              <w:t>I confirm that have read and understood the information sheet about this study</w:t>
+              <w:t>I confirm that</w:t>
+            </w:r>
+            <w:r>
+              <w:t xml:space="preserve"> I</w:t>
+            </w:r>
+            <w:r>
+              <w:t xml:space="preserve"> have read and understood the information sheet about this study</w:t>
             </w:r>
           </w:p>
         </w:tc>
@@ -759,13 +765,7 @@
           </w:tcPr>
           <w:p>
             <w:r>
-              <w:t xml:space="preserve">I understand that I may request deletion of my data at any time **before** the dataset is </w:t>
-            </w:r>
-            <w:r>
-              <w:t xml:space="preserve">anonymized, </w:t>
-            </w:r>
-            <w:r>
-              <w:t>by using the withdrawal option in my account settings or by emailing andy.woods@rhul.ac.uk. After anonymisation, individual data can no longer be identified or removed.</w:t>
+              <w:t xml:space="preserve">I understand that I may request the automatic deletion of my data within moments at any time before the dataset is anonymised, by using the withdrawal option in my account settings or by emailing andy.woods@rhul.ac.uk. After anonymisation, individual data can no longer be identified or removed. </w:t>
             </w:r>
           </w:p>
         </w:tc>
@@ -794,27 +794,24 @@
           </w:tcPr>
           <w:p>
             <w:r>
-              <w:t xml:space="preserve">I </w:t>
+              <w:t>I understand that identifiable account data, including my email address, will be deleted automatically within moments if I withdraw from the study before the dataset is anonymised. If I do not withdraw, these data will be deleted 12 months after I started the study.</w:t>
             </w:r>
+          </w:p>
+        </w:tc>
+      </w:tr>
+      <w:tr>
+        <w:tc>
+          <w:tcPr>
+            <w:tcW w:w="10343" w:type="dxa"/>
+          </w:tcPr>
+          <w:p>
             <w:r>
-              <w:t>understand that I will</w:t>
-            </w:r>
-            <w:r>
-              <w:t xml:space="preserve"> receive periodic session reminder emails (approximately monthly) during my    </w:t>
+              <w:t xml:space="preserve">I understand that I will receive periodic session reminder emails (approximately monthly) during my    </w:t>
             </w:r>
           </w:p>
           <w:p>
             <w:r>
-              <w:t xml:space="preserve">  </w:t>
-            </w:r>
-            <w:r>
-              <w:t>P</w:t>
-            </w:r>
-            <w:r>
-              <w:t>articipatio</w:t>
-            </w:r>
-            <w:r>
-              <w:t>n (</w:t>
+              <w:t xml:space="preserve">  Participation (</w:t>
             </w:r>
             <w:r>
               <w:t>you can change this preference at any time in your account settings</w:t>
@@ -873,6 +870,19 @@
           </w:p>
         </w:tc>
       </w:tr>
+      <w:tr>
+        <w:tc>
+          <w:tcPr>
+            <w:tcW w:w="10343" w:type="dxa"/>
+          </w:tcPr>
+          <w:p>
+            <w:r>
+              <w:lastRenderedPageBreak/>
+              <w:t>I confirm that I am sufficiently comfortable reading English to understand the information sheet, what participation involves, and my rights as a participant, and that I have had the opportunity to ask questions before consenting.</w:t>
+            </w:r>
+          </w:p>
+        </w:tc>
+      </w:tr>
     </w:tbl>
     <w:p/>
     <w:p>
@@ -898,7 +908,6 @@
     </w:p>
     <w:p>
       <w:r>
-        <w:lastRenderedPageBreak/>
         <w:t xml:space="preserve">If you have any concerns about this research, please email </w:t>
       </w:r>
       <w:hyperlink r:id="rId8" w:history="1">

</xml_diff>

<commit_message>
ethics update now track changed
</commit_message>
<xml_diff>
--- a/ethics/consent-form 26-3-26.docx
+++ b/ethics/consent-form 26-3-26.docx
@@ -482,7 +482,7 @@
         <w:rPr>
           <w:noProof/>
         </w:rPr>
-        <w:pict w14:anchorId="12C10632">
+        <w:pict w14:anchorId="1ADA1F54">
           <v:rect id="_x0000_i1025" alt="" style="width:451.3pt;height:.05pt;mso-width-percent:0;mso-height-percent:0;mso-width-percent:0;mso-height-percent:0" o:hralign="center" o:hrstd="t" o:hr="t" fillcolor="#a0a0a0" stroked="f"/>
         </w:pict>
       </w:r>
@@ -662,13 +662,15 @@
               <w:spacing w:after="60"/>
             </w:pPr>
             <w:r>
-              <w:t>I confirm that</w:t>
+              <w:t xml:space="preserve">I confirm that </w:t>
             </w:r>
+            <w:ins w:id="0" w:author="Woods, Andy" w:date="2026-04-16T18:03:00Z" w16du:dateUtc="2026-04-16T17:03:00Z">
+              <w:r>
+                <w:t xml:space="preserve">I </w:t>
+              </w:r>
+            </w:ins>
             <w:r>
-              <w:t xml:space="preserve"> I</w:t>
-            </w:r>
-            <w:r>
-              <w:t xml:space="preserve"> have read and understood the information sheet about this study</w:t>
+              <w:t>have read and understood the information sheet about this study</w:t>
             </w:r>
           </w:p>
         </w:tc>
@@ -764,9 +766,22 @@
             <w:tcW w:w="10343" w:type="dxa"/>
           </w:tcPr>
           <w:p>
-            <w:r>
-              <w:t xml:space="preserve">I understand that I may request the automatic deletion of my data within moments at any time before the dataset is anonymised, by using the withdrawal option in my account settings or by emailing andy.woods@rhul.ac.uk. After anonymisation, individual data can no longer be identified or removed. </w:t>
-            </w:r>
+            <w:ins w:id="1" w:author="Woods, Andy" w:date="2026-04-16T18:04:00Z" w16du:dateUtc="2026-04-16T17:04:00Z">
+              <w:r>
+                <w:t>I understand that I may request the automatic deletion of my data within moments at any time before the dataset is anonymised, by using the withdrawal option in my account settings or by emailing andy.woods@rhul.ac.uk. After anonymisation, individual data can no longer be identified or removed.</w:t>
+              </w:r>
+            </w:ins>
+            <w:del w:id="2" w:author="Woods, Andy" w:date="2026-04-16T18:04:00Z" w16du:dateUtc="2026-04-16T17:04:00Z">
+              <w:r>
+                <w:delText xml:space="preserve">I understand that I may request deletion of my data at any time **before** the dataset is </w:delText>
+              </w:r>
+              <w:r>
+                <w:delText xml:space="preserve">anonymized, </w:delText>
+              </w:r>
+              <w:r>
+                <w:delText>by using the withdrawal option in my account settings or by emailing andy.woods@rhul.ac.uk. After anonymisation, individual data can no longer be identified or removed.</w:delText>
+              </w:r>
+            </w:del>
           </w:p>
         </w:tc>
       </w:tr>
@@ -788,14 +803,24 @@
         </w:tc>
       </w:tr>
       <w:tr>
+        <w:trPr>
+          <w:ins w:id="3" w:author="Woods, Andy" w:date="2026-04-16T18:05:00Z" w16du:dateUtc="2026-04-16T17:05:00Z"/>
+        </w:trPr>
         <w:tc>
           <w:tcPr>
             <w:tcW w:w="10343" w:type="dxa"/>
           </w:tcPr>
           <w:p>
-            <w:r>
-              <w:t>I understand that identifiable account data, including my email address, will be deleted automatically within moments if I withdraw from the study before the dataset is anonymised. If I do not withdraw, these data will be deleted 12 months after I started the study.</w:t>
-            </w:r>
+            <w:pPr>
+              <w:rPr>
+                <w:ins w:id="4" w:author="Woods, Andy" w:date="2026-04-16T18:05:00Z" w16du:dateUtc="2026-04-16T17:05:00Z"/>
+              </w:rPr>
+            </w:pPr>
+            <w:ins w:id="5" w:author="Woods, Andy" w:date="2026-04-16T18:05:00Z" w16du:dateUtc="2026-04-16T17:05:00Z">
+              <w:r>
+                <w:t>I understand that identifiable account data, including my email address, will be deleted automatically within moments if I withdraw from the study before the dataset is anonymised. If I do not withdraw, these data will be deleted 12 months after I started the study.</w:t>
+              </w:r>
+            </w:ins>
           </w:p>
         </w:tc>
       </w:tr>
@@ -871,23 +896,33 @@
         </w:tc>
       </w:tr>
       <w:tr>
+        <w:trPr>
+          <w:ins w:id="6" w:author="Woods, Andy" w:date="2026-04-16T18:05:00Z" w16du:dateUtc="2026-04-16T17:05:00Z"/>
+        </w:trPr>
         <w:tc>
           <w:tcPr>
             <w:tcW w:w="10343" w:type="dxa"/>
           </w:tcPr>
           <w:p>
-            <w:r>
-              <w:lastRenderedPageBreak/>
-              <w:t>I confirm that I am sufficiently comfortable reading English to understand the information sheet, what participation involves, and my rights as a participant, and that I have had the opportunity to ask questions before consenting.</w:t>
-            </w:r>
+            <w:pPr>
+              <w:rPr>
+                <w:ins w:id="7" w:author="Woods, Andy" w:date="2026-04-16T18:05:00Z" w16du:dateUtc="2026-04-16T17:05:00Z"/>
+              </w:rPr>
+            </w:pPr>
+            <w:ins w:id="8" w:author="Woods, Andy" w:date="2026-04-16T18:05:00Z" w16du:dateUtc="2026-04-16T17:05:00Z">
+              <w:r>
+                <w:lastRenderedPageBreak/>
+                <w:t>I confirm that I am sufficiently comfortable reading English to understand the information sheet, what participation involves, and my rights as a participant, and that I have had the opportunity to ask questions before consenting.</w:t>
+              </w:r>
+            </w:ins>
           </w:p>
         </w:tc>
       </w:tr>
     </w:tbl>
     <w:p/>
     <w:p>
-      <w:bookmarkStart w:id="0" w:name="_gjdgxs" w:colFirst="0" w:colLast="0"/>
-      <w:bookmarkEnd w:id="0"/>
+      <w:bookmarkStart w:id="9" w:name="_gjdgxs" w:colFirst="0" w:colLast="0"/>
+      <w:bookmarkEnd w:id="9"/>
       <w:r>
         <w:t>I consent (button)</w:t>
       </w:r>
@@ -1218,6 +1253,14 @@
     <w:abstractNumId w:val="1"/>
   </w:num>
 </w:numbering>
+</file>
+
+<file path=word/people.xml><?xml version="1.0" encoding="utf-8"?>
+<w15:people xmlns:wpc="http://schemas.microsoft.com/office/word/2010/wordprocessingCanvas" xmlns:cx="http://schemas.microsoft.com/office/drawing/2014/chartex" xmlns:cx1="http://schemas.microsoft.com/office/drawing/2015/9/8/chartex" xmlns:cx2="http://schemas.microsoft.com/office/drawing/2015/10/21/chartex" xmlns:cx3="http://schemas.microsoft.com/office/drawing/2016/5/9/chartex" xmlns:cx4="http://schemas.microsoft.com/office/drawing/2016/5/10/chartex" xmlns:cx5="http://schemas.microsoft.com/office/drawing/2016/5/11/chartex" xmlns:cx6="http://schemas.microsoft.com/office/drawing/2016/5/12/chartex" xmlns:cx7="http://schemas.microsoft.com/office/drawing/2016/5/13/chartex" xmlns:cx8="http://schemas.microsoft.com/office/drawing/2016/5/14/chartex" xmlns:mc="http://schemas.openxmlformats.org/markup-compatibility/2006" xmlns:aink="http://schemas.microsoft.com/office/drawing/2016/ink" xmlns:am3d="http://schemas.microsoft.com/office/drawing/2017/model3d" xmlns:o="urn:schemas-microsoft-com:office:office" xmlns:oel="http://schemas.microsoft.com/office/2019/extlst" xmlns:r="http://schemas.openxmlformats.org/officeDocument/2006/relationships" xmlns:m="http://schemas.openxmlformats.org/officeDocument/2006/math" xmlns:v="urn:schemas-microsoft-com:vml" xmlns:wp14="http://schemas.microsoft.com/office/word/2010/wordprocessingDrawing" xmlns:wp="http://schemas.openxmlformats.org/drawingml/2006/wordprocessingDrawing" xmlns:w10="urn:schemas-microsoft-com:office:word" xmlns:w="http://schemas.openxmlformats.org/wordprocessingml/2006/main" xmlns:w14="http://schemas.microsoft.com/office/word/2010/wordml" xmlns:w15="http://schemas.microsoft.com/office/word/2012/wordml" xmlns:w16cex="http://schemas.microsoft.com/office/word/2018/wordml/cex" xmlns:w16cid="http://schemas.microsoft.com/office/word/2016/wordml/cid" xmlns:w16="http://schemas.microsoft.com/office/word/2018/wordml" xmlns:w16du="http://schemas.microsoft.com/office/word/2023/wordml/word16du" xmlns:w16sdtdh="http://schemas.microsoft.com/office/word/2020/wordml/sdtdatahash" xmlns:w16sdtfl="http://schemas.microsoft.com/office/word/2024/wordml/sdtformatlock" xmlns:w16se="http://schemas.microsoft.com/office/word/2015/wordml/symex" xmlns:wpg="http://schemas.microsoft.com/office/word/2010/wordprocessingGroup" xmlns:wpi="http://schemas.microsoft.com/office/word/2010/wordprocessingInk" xmlns:wne="http://schemas.microsoft.com/office/word/2006/wordml" xmlns:wps="http://schemas.microsoft.com/office/word/2010/wordprocessingShape" mc:Ignorable="w14 w15 w16se w16cid w16 w16cex w16sdtdh w16sdtfl w16du wp14">
+  <w15:person w15:author="Woods, Andy">
+    <w15:presenceInfo w15:providerId="AD" w15:userId="S::Andy.Woods@rhul.ac.uk::1f14b3a1-f1dd-4da3-82b5-993b98b7bcdb"/>
+  </w15:person>
+</w15:people>
 </file>
 
 <file path=word/styles.xml><?xml version="1.0" encoding="utf-8"?>
@@ -1934,6 +1977,16 @@
       <w:lang w:val="en-GB"/>
     </w:rPr>
   </w:style>
+  <w:style w:type="paragraph" w:styleId="Revision">
+    <w:name w:val="Revision"/>
+    <w:hidden/>
+    <w:uiPriority w:val="99"/>
+    <w:semiHidden/>
+    <w:rsid w:val="00E754F1"/>
+    <w:pPr>
+      <w:spacing w:after="0" w:line="240" w:lineRule="auto"/>
+    </w:pPr>
+  </w:style>
 </w:styles>
 </file>
 

</xml_diff>